<commit_message>
fix(typography): eliminate newline justification stretching bug and fix heading orphans
</commit_message>
<xml_diff>
--- a/Bao_Cao/Bao_Cao_Tong_Ket_Do_An_BigData_Chuan_AI_10Diem.docx
+++ b/Bao_Cao/Bao_Cao_Tong_Ket_Do_An_BigData_Chuan_AI_10Diem.docx
@@ -1812,6 +1812,7 @@
     </w:p>
     <w:p>
       <w:pPr>
+        <w:keepNext/>
         <w:spacing w:before="240" w:after="60" w:line="276" w:lineRule="auto"/>
         <w:jc w:val="left"/>
       </w:pPr>
@@ -1829,6 +1830,7 @@
     </w:p>
     <w:p>
       <w:pPr>
+        <w:keepNext/>
         <w:spacing w:before="160" w:after="40" w:line="276" w:lineRule="auto"/>
         <w:jc w:val="left"/>
       </w:pPr>
@@ -1863,9 +1865,32 @@
     </w:p>
     <w:p>
       <w:pPr>
-        <w:spacing w:before="0" w:after="60" w:line="276" w:lineRule="auto"/>
+        <w:spacing w:before="20" w:after="40" w:line="276" w:lineRule="auto"/>
+        <w:ind w:left="283"/>
         <w:jc w:val="both"/>
       </w:pPr>
+      <w:r>
+        <w:rPr>
+          <w:rFonts w:ascii="Times New Roman" w:hAnsi="Times New Roman"/>
+          <w:b/>
+          <w:i w:val="0"/>
+          <w:color w:val="0D766E"/>
+          <w:sz w:val="22"/>
+          <w:rFonts w:ascii="Times New Roman" w:hAnsi="Times New Roman" w:eastAsia="Times New Roman" w:cs="Times New Roman"/>
+        </w:rPr>
+        <w:t xml:space="preserve">1. </w:t>
+      </w:r>
+      <w:r>
+        <w:rPr>
+          <w:rFonts w:ascii="Times New Roman" w:hAnsi="Times New Roman"/>
+          <w:b/>
+          <w:i w:val="0"/>
+          <w:color w:val="1B365D"/>
+          <w:sz w:val="22"/>
+          <w:rFonts w:ascii="Times New Roman" w:hAnsi="Times New Roman" w:eastAsia="Times New Roman" w:cs="Times New Roman"/>
+        </w:rPr>
+        <w:t xml:space="preserve">Xây dựng Data Lake phân tán: </w:t>
+      </w:r>
       <w:r>
         <w:rPr>
           <w:rFonts w:ascii="Times New Roman" w:hAnsi="Times New Roman"/>
@@ -1875,15 +1900,92 @@
           <w:sz w:val="22"/>
           <w:rFonts w:ascii="Times New Roman" w:hAnsi="Times New Roman" w:eastAsia="Times New Roman" w:cs="Times New Roman"/>
         </w:rPr>
-        <w:t>1. Xây dựng Data Lake phân tán trên Hadoop HDFS và thiết kế pipeline PySpark ETL làm sạch, chuẩn hóa hơn 7.49 triệu bản ghi thô từ 12 bảng dữ liệu.</w:t>
-        <w:br/>
-        <w:t>2. Khai phá dữ liệu đa chiều bằng Spark SQL và phân cụm đẳng cấp cầu thủ (K-Means Clustering) thành 3 phân khúc thị trường rõ rệt.</w:t>
-        <w:br/>
-        <w:t>3. Huấn luyện mô hình Random Forest Regressor dự đoán giá trị chuyển nhượng với độ chính xác R2 &gt; 84%, tích hợp Explainable AI (XAI) và bộ máy tìm kiếm cầu thủ theo ngân sách (Scouting Engine).</w:t>
+        <w:t>Xây dựng Data Lake phân tán trên Hadoop HDFS và thiết kế pipeline PySpark ETL làm sạch, chuẩn hóa hơn 7.49 triệu bản ghi thô từ 12 bảng dữ liệu.</w:t>
       </w:r>
     </w:p>
     <w:p>
       <w:pPr>
+        <w:spacing w:before="20" w:after="40" w:line="276" w:lineRule="auto"/>
+        <w:ind w:left="283"/>
+        <w:jc w:val="both"/>
+      </w:pPr>
+      <w:r>
+        <w:rPr>
+          <w:rFonts w:ascii="Times New Roman" w:hAnsi="Times New Roman"/>
+          <w:b/>
+          <w:i w:val="0"/>
+          <w:color w:val="0D766E"/>
+          <w:sz w:val="22"/>
+          <w:rFonts w:ascii="Times New Roman" w:hAnsi="Times New Roman" w:eastAsia="Times New Roman" w:cs="Times New Roman"/>
+        </w:rPr>
+        <w:t xml:space="preserve">2. </w:t>
+      </w:r>
+      <w:r>
+        <w:rPr>
+          <w:rFonts w:ascii="Times New Roman" w:hAnsi="Times New Roman"/>
+          <w:b/>
+          <w:i w:val="0"/>
+          <w:color w:val="1B365D"/>
+          <w:sz w:val="22"/>
+          <w:rFonts w:ascii="Times New Roman" w:hAnsi="Times New Roman" w:eastAsia="Times New Roman" w:cs="Times New Roman"/>
+        </w:rPr>
+        <w:t xml:space="preserve">Khai phá dữ liệu đa chiều: </w:t>
+      </w:r>
+      <w:r>
+        <w:rPr>
+          <w:rFonts w:ascii="Times New Roman" w:hAnsi="Times New Roman"/>
+          <w:b w:val="0"/>
+          <w:i w:val="0"/>
+          <w:color w:val="222222"/>
+          <w:sz w:val="22"/>
+          <w:rFonts w:ascii="Times New Roman" w:hAnsi="Times New Roman" w:eastAsia="Times New Roman" w:cs="Times New Roman"/>
+        </w:rPr>
+        <w:t>Khai phá dữ liệu đa chiều bằng Spark SQL và phân cụm đẳng cấp cầu thủ (K-Means Clustering) thành 3 phân khúc thị trường rõ rệt.</w:t>
+      </w:r>
+    </w:p>
+    <w:p>
+      <w:pPr>
+        <w:spacing w:before="20" w:after="40" w:line="276" w:lineRule="auto"/>
+        <w:ind w:left="283"/>
+        <w:jc w:val="both"/>
+      </w:pPr>
+      <w:r>
+        <w:rPr>
+          <w:rFonts w:ascii="Times New Roman" w:hAnsi="Times New Roman"/>
+          <w:b/>
+          <w:i w:val="0"/>
+          <w:color w:val="0D766E"/>
+          <w:sz w:val="22"/>
+          <w:rFonts w:ascii="Times New Roman" w:hAnsi="Times New Roman" w:eastAsia="Times New Roman" w:cs="Times New Roman"/>
+        </w:rPr>
+        <w:t xml:space="preserve">3. </w:t>
+      </w:r>
+      <w:r>
+        <w:rPr>
+          <w:rFonts w:ascii="Times New Roman" w:hAnsi="Times New Roman"/>
+          <w:b/>
+          <w:i w:val="0"/>
+          <w:color w:val="1B365D"/>
+          <w:sz w:val="22"/>
+          <w:rFonts w:ascii="Times New Roman" w:hAnsi="Times New Roman" w:eastAsia="Times New Roman" w:cs="Times New Roman"/>
+        </w:rPr>
+        <w:t xml:space="preserve">Huấn luyện học máy &amp; XAI: </w:t>
+      </w:r>
+      <w:r>
+        <w:rPr>
+          <w:rFonts w:ascii="Times New Roman" w:hAnsi="Times New Roman"/>
+          <w:b w:val="0"/>
+          <w:i w:val="0"/>
+          <w:color w:val="222222"/>
+          <w:sz w:val="22"/>
+          <w:rFonts w:ascii="Times New Roman" w:hAnsi="Times New Roman" w:eastAsia="Times New Roman" w:cs="Times New Roman"/>
+        </w:rPr>
+        <w:t>Huấn luyện mô hình Random Forest Regressor dự đoán giá trị chuyển nhượng với độ chính xác R2 &gt; 84%, tích hợp Explainable AI (XAI) và bộ máy tìm kiếm cầu thủ theo ngân sách (Scouting Engine).</w:t>
+      </w:r>
+    </w:p>
+    <w:p>
+      <w:pPr>
+        <w:keepNext/>
         <w:spacing w:before="160" w:after="40" w:line="276" w:lineRule="auto"/>
         <w:jc w:val="left"/>
       </w:pPr>
@@ -4091,6 +4193,7 @@
     </w:p>
     <w:p>
       <w:pPr>
+        <w:keepNext/>
         <w:spacing w:before="160" w:after="40" w:line="276" w:lineRule="auto"/>
         <w:jc w:val="left"/>
       </w:pPr>
@@ -4108,6 +4211,7 @@
     </w:p>
     <w:p>
       <w:pPr>
+        <w:keepNext/>
         <w:spacing w:before="0" w:after="60" w:line="276" w:lineRule="auto"/>
         <w:jc w:val="both"/>
       </w:pPr>
@@ -4125,9 +4229,32 @@
     </w:p>
     <w:p>
       <w:pPr>
-        <w:spacing w:before="0" w:after="60" w:line="276" w:lineRule="auto"/>
+        <w:spacing w:before="20" w:after="40" w:line="276" w:lineRule="auto"/>
+        <w:ind w:left="283"/>
         <w:jc w:val="both"/>
       </w:pPr>
+      <w:r>
+        <w:rPr>
+          <w:rFonts w:ascii="Times New Roman" w:hAnsi="Times New Roman"/>
+          <w:b/>
+          <w:i w:val="0"/>
+          <w:color w:val="0D766E"/>
+          <w:sz w:val="22"/>
+          <w:rFonts w:ascii="Times New Roman" w:hAnsi="Times New Roman" w:eastAsia="Times New Roman" w:cs="Times New Roman"/>
+        </w:rPr>
+        <w:t xml:space="preserve">• </w:t>
+      </w:r>
+      <w:r>
+        <w:rPr>
+          <w:rFonts w:ascii="Times New Roman" w:hAnsi="Times New Roman"/>
+          <w:b/>
+          <w:i w:val="0"/>
+          <w:color w:val="1B365D"/>
+          <w:sz w:val="22"/>
+          <w:rFonts w:ascii="Times New Roman" w:hAnsi="Times New Roman" w:eastAsia="Times New Roman" w:cs="Times New Roman"/>
+        </w:rPr>
+        <w:t xml:space="preserve">Lớp Data Lake (HDFS): </w:t>
+      </w:r>
       <w:r>
         <w:rPr>
           <w:rFonts w:ascii="Times New Roman" w:hAnsi="Times New Roman"/>
@@ -4137,15 +4264,167 @@
           <w:sz w:val="22"/>
           <w:rFonts w:ascii="Times New Roman" w:hAnsi="Times New Roman" w:eastAsia="Times New Roman" w:cs="Times New Roman"/>
         </w:rPr>
-        <w:t>• Lớp Data Lake (HDFS): Hadoop 3.3.6 lưu trữ dữ liệu thô (Replication factor = 3, Block size = 128MB).</w:t>
-        <w:br/>
-        <w:t>• Lớp Xử lý Lô (Batch Layer - Spark): Apache Spark 4.2 thực hiện ETL làm sạch, phân tích Spark SQL và học máy phân tán MLlib.</w:t>
-        <w:br/>
-        <w:t>• Lớp Xử lý Luồng (Speed Layer - Kafka): Apache Kafka 3.x tại cổng 9092, topic football_transfers tiếp nhận dòng giao dịch JSON.</w:t>
-        <w:br/>
-        <w:t>• Lớp Điều phối (Orchestration - Airflow): Apache Airflow 2.10 chạy Docker Compose điều phối DAG 7 task tuần tự 100% SUCCESS.</w:t>
-        <w:br/>
-        <w:t>• Lớp Phục vụ (Serving &amp; UI): Xuất kết quả sang Parquet Snappy và SQLite (football_analytics.db), phục vụ Web Dashboard Streamlit phản hồi tức thì &lt; 35ms.</w:t>
+        <w:t>Hadoop 3.3.6 lưu trữ dữ liệu thô an toàn trên cụm phân tán (Replication factor = 3, Block size = 128MB).</w:t>
+      </w:r>
+    </w:p>
+    <w:p>
+      <w:pPr>
+        <w:spacing w:before="20" w:after="40" w:line="276" w:lineRule="auto"/>
+        <w:ind w:left="283"/>
+        <w:jc w:val="both"/>
+      </w:pPr>
+      <w:r>
+        <w:rPr>
+          <w:rFonts w:ascii="Times New Roman" w:hAnsi="Times New Roman"/>
+          <w:b/>
+          <w:i w:val="0"/>
+          <w:color w:val="0D766E"/>
+          <w:sz w:val="22"/>
+          <w:rFonts w:ascii="Times New Roman" w:hAnsi="Times New Roman" w:eastAsia="Times New Roman" w:cs="Times New Roman"/>
+        </w:rPr>
+        <w:t xml:space="preserve">• </w:t>
+      </w:r>
+      <w:r>
+        <w:rPr>
+          <w:rFonts w:ascii="Times New Roman" w:hAnsi="Times New Roman"/>
+          <w:b/>
+          <w:i w:val="0"/>
+          <w:color w:val="1B365D"/>
+          <w:sz w:val="22"/>
+          <w:rFonts w:ascii="Times New Roman" w:hAnsi="Times New Roman" w:eastAsia="Times New Roman" w:cs="Times New Roman"/>
+        </w:rPr>
+        <w:t xml:space="preserve">Lớp Xử lý Lô (Batch Layer - Spark): </w:t>
+      </w:r>
+      <w:r>
+        <w:rPr>
+          <w:rFonts w:ascii="Times New Roman" w:hAnsi="Times New Roman"/>
+          <w:b w:val="0"/>
+          <w:i w:val="0"/>
+          <w:color w:val="222222"/>
+          <w:sz w:val="22"/>
+          <w:rFonts w:ascii="Times New Roman" w:hAnsi="Times New Roman" w:eastAsia="Times New Roman" w:cs="Times New Roman"/>
+        </w:rPr>
+        <w:t>Apache Spark 4.2 thực hiện ETL làm sạch, phân tích Spark SQL và học máy phân tán MLlib.</w:t>
+      </w:r>
+    </w:p>
+    <w:p>
+      <w:pPr>
+        <w:spacing w:before="20" w:after="40" w:line="276" w:lineRule="auto"/>
+        <w:ind w:left="283"/>
+        <w:jc w:val="both"/>
+      </w:pPr>
+      <w:r>
+        <w:rPr>
+          <w:rFonts w:ascii="Times New Roman" w:hAnsi="Times New Roman"/>
+          <w:b/>
+          <w:i w:val="0"/>
+          <w:color w:val="0D766E"/>
+          <w:sz w:val="22"/>
+          <w:rFonts w:ascii="Times New Roman" w:hAnsi="Times New Roman" w:eastAsia="Times New Roman" w:cs="Times New Roman"/>
+        </w:rPr>
+        <w:t xml:space="preserve">• </w:t>
+      </w:r>
+      <w:r>
+        <w:rPr>
+          <w:rFonts w:ascii="Times New Roman" w:hAnsi="Times New Roman"/>
+          <w:b/>
+          <w:i w:val="0"/>
+          <w:color w:val="1B365D"/>
+          <w:sz w:val="22"/>
+          <w:rFonts w:ascii="Times New Roman" w:hAnsi="Times New Roman" w:eastAsia="Times New Roman" w:cs="Times New Roman"/>
+        </w:rPr>
+        <w:t xml:space="preserve">Lớp Xử lý Luồng (Speed Layer - Kafka): </w:t>
+      </w:r>
+      <w:r>
+        <w:rPr>
+          <w:rFonts w:ascii="Times New Roman" w:hAnsi="Times New Roman"/>
+          <w:b w:val="0"/>
+          <w:i w:val="0"/>
+          <w:color w:val="222222"/>
+          <w:sz w:val="22"/>
+          <w:rFonts w:ascii="Times New Roman" w:hAnsi="Times New Roman" w:eastAsia="Times New Roman" w:cs="Times New Roman"/>
+        </w:rPr>
+        <w:t>Apache Kafka 3.x tại cổng 9092, topic football_transfers tiếp nhận dòng giao dịch JSON.</w:t>
+      </w:r>
+    </w:p>
+    <w:p>
+      <w:pPr>
+        <w:spacing w:before="20" w:after="40" w:line="276" w:lineRule="auto"/>
+        <w:ind w:left="283"/>
+        <w:jc w:val="both"/>
+      </w:pPr>
+      <w:r>
+        <w:rPr>
+          <w:rFonts w:ascii="Times New Roman" w:hAnsi="Times New Roman"/>
+          <w:b/>
+          <w:i w:val="0"/>
+          <w:color w:val="0D766E"/>
+          <w:sz w:val="22"/>
+          <w:rFonts w:ascii="Times New Roman" w:hAnsi="Times New Roman" w:eastAsia="Times New Roman" w:cs="Times New Roman"/>
+        </w:rPr>
+        <w:t xml:space="preserve">• </w:t>
+      </w:r>
+      <w:r>
+        <w:rPr>
+          <w:rFonts w:ascii="Times New Roman" w:hAnsi="Times New Roman"/>
+          <w:b/>
+          <w:i w:val="0"/>
+          <w:color w:val="1B365D"/>
+          <w:sz w:val="22"/>
+          <w:rFonts w:ascii="Times New Roman" w:hAnsi="Times New Roman" w:eastAsia="Times New Roman" w:cs="Times New Roman"/>
+        </w:rPr>
+        <w:t xml:space="preserve">Lớp Điều phối (Orchestration - Airflow): </w:t>
+      </w:r>
+      <w:r>
+        <w:rPr>
+          <w:rFonts w:ascii="Times New Roman" w:hAnsi="Times New Roman"/>
+          <w:b w:val="0"/>
+          <w:i w:val="0"/>
+          <w:color w:val="222222"/>
+          <w:sz w:val="22"/>
+          <w:rFonts w:ascii="Times New Roman" w:hAnsi="Times New Roman" w:eastAsia="Times New Roman" w:cs="Times New Roman"/>
+        </w:rPr>
+        <w:t>Apache Airflow 2.10 chạy Docker Compose điều phối DAG 7 task tuần tự 100% SUCCESS.</w:t>
+      </w:r>
+    </w:p>
+    <w:p>
+      <w:pPr>
+        <w:spacing w:before="20" w:after="40" w:line="276" w:lineRule="auto"/>
+        <w:ind w:left="283"/>
+        <w:jc w:val="both"/>
+      </w:pPr>
+      <w:r>
+        <w:rPr>
+          <w:rFonts w:ascii="Times New Roman" w:hAnsi="Times New Roman"/>
+          <w:b/>
+          <w:i w:val="0"/>
+          <w:color w:val="0D766E"/>
+          <w:sz w:val="22"/>
+          <w:rFonts w:ascii="Times New Roman" w:hAnsi="Times New Roman" w:eastAsia="Times New Roman" w:cs="Times New Roman"/>
+        </w:rPr>
+        <w:t xml:space="preserve">• </w:t>
+      </w:r>
+      <w:r>
+        <w:rPr>
+          <w:rFonts w:ascii="Times New Roman" w:hAnsi="Times New Roman"/>
+          <w:b/>
+          <w:i w:val="0"/>
+          <w:color w:val="1B365D"/>
+          <w:sz w:val="22"/>
+          <w:rFonts w:ascii="Times New Roman" w:hAnsi="Times New Roman" w:eastAsia="Times New Roman" w:cs="Times New Roman"/>
+        </w:rPr>
+        <w:t xml:space="preserve">Lớp Phục vụ (Serving &amp; UI): </w:t>
+      </w:r>
+      <w:r>
+        <w:rPr>
+          <w:rFonts w:ascii="Times New Roman" w:hAnsi="Times New Roman"/>
+          <w:b w:val="0"/>
+          <w:i w:val="0"/>
+          <w:color w:val="222222"/>
+          <w:sz w:val="22"/>
+          <w:rFonts w:ascii="Times New Roman" w:hAnsi="Times New Roman" w:eastAsia="Times New Roman" w:cs="Times New Roman"/>
+        </w:rPr>
+        <w:t>Xuất kết quả sang Parquet Snappy và SQLite (football_analytics.db), phục vụ Web Dashboard Streamlit phản hồi tức thì &lt; 35ms.</w:t>
       </w:r>
     </w:p>
     <w:p>
@@ -4155,6 +4434,7 @@
     </w:p>
     <w:p>
       <w:pPr>
+        <w:keepNext/>
         <w:spacing w:before="240" w:after="60" w:line="276" w:lineRule="auto"/>
         <w:jc w:val="left"/>
       </w:pPr>
@@ -4172,6 +4452,7 @@
     </w:p>
     <w:p>
       <w:pPr>
+        <w:keepNext/>
         <w:spacing w:before="160" w:after="40" w:line="276" w:lineRule="auto"/>
         <w:jc w:val="left"/>
       </w:pPr>
@@ -4280,6 +4561,7 @@
     </w:p>
     <w:p>
       <w:pPr>
+        <w:keepNext/>
         <w:spacing w:before="160" w:after="40" w:line="276" w:lineRule="auto"/>
         <w:jc w:val="left"/>
       </w:pPr>
@@ -4427,6 +4709,7 @@
     </w:p>
     <w:p>
       <w:pPr>
+        <w:keepNext/>
         <w:spacing w:before="160" w:after="40" w:line="276" w:lineRule="auto"/>
         <w:jc w:val="left"/>
       </w:pPr>
@@ -4506,6 +4789,7 @@
     </w:p>
     <w:p>
       <w:pPr>
+        <w:keepNext/>
         <w:spacing w:before="240" w:after="60" w:line="276" w:lineRule="auto"/>
         <w:jc w:val="left"/>
       </w:pPr>
@@ -4523,6 +4807,7 @@
     </w:p>
     <w:p>
       <w:pPr>
+        <w:keepNext/>
         <w:spacing w:before="160" w:after="40" w:line="276" w:lineRule="auto"/>
         <w:jc w:val="left"/>
       </w:pPr>
@@ -4765,6 +5050,7 @@
     </w:p>
     <w:p>
       <w:pPr>
+        <w:keepNext/>
         <w:spacing w:before="160" w:after="40" w:line="276" w:lineRule="auto"/>
         <w:jc w:val="left"/>
       </w:pPr>
@@ -4799,9 +5085,32 @@
     </w:p>
     <w:p>
       <w:pPr>
-        <w:spacing w:before="0" w:after="60" w:line="276" w:lineRule="auto"/>
+        <w:spacing w:before="20" w:after="40" w:line="276" w:lineRule="auto"/>
+        <w:ind w:left="283"/>
         <w:jc w:val="both"/>
       </w:pPr>
+      <w:r>
+        <w:rPr>
+          <w:rFonts w:ascii="Times New Roman" w:hAnsi="Times New Roman"/>
+          <w:b/>
+          <w:i w:val="0"/>
+          <w:color w:val="0D766E"/>
+          <w:sz w:val="22"/>
+          <w:rFonts w:ascii="Times New Roman" w:hAnsi="Times New Roman" w:eastAsia="Times New Roman" w:cs="Times New Roman"/>
+        </w:rPr>
+        <w:t xml:space="preserve">• </w:t>
+      </w:r>
+      <w:r>
+        <w:rPr>
+          <w:rFonts w:ascii="Times New Roman" w:hAnsi="Times New Roman"/>
+          <w:b/>
+          <w:i w:val="0"/>
+          <w:color w:val="1B365D"/>
+          <w:sz w:val="22"/>
+          <w:rFonts w:ascii="Times New Roman" w:hAnsi="Times New Roman" w:eastAsia="Times New Roman" w:cs="Times New Roman"/>
+        </w:rPr>
+        <w:t xml:space="preserve">Truy vấn 1 (Q1): </w:t>
+      </w:r>
       <w:r>
         <w:rPr>
           <w:rFonts w:ascii="Times New Roman" w:hAnsi="Times New Roman"/>
@@ -4811,13 +5120,127 @@
           <w:sz w:val="22"/>
           <w:rFonts w:ascii="Times New Roman" w:hAnsi="Times New Roman" w:eastAsia="Times New Roman" w:cs="Times New Roman"/>
         </w:rPr>
-        <w:t>• Q1: Top 15 cầu thủ giá trị cao nhất thế giới (Erling Haaland, Vinicius, Bellingham, Mbappe: 180M - 200M EUR).</w:t>
-        <w:br/>
-        <w:t>• Q2: Định giá trung bình theo 4 vị trí chiến thuật (Attack: 3.2M EUR, Midfield: 2.8M EUR, Defender: 2.1M EUR, Goalkeeper: 1.4M EUR).</w:t>
-        <w:br/>
-        <w:t>• Q3: Top 10 quốc gia sở hữu tổng giá trị cầu thủ lớn nhất thế giới (Anh: 4.8B EUR, Pháp: 4.2B EUR, TBN: 3.9B EUR, Brazil: 3.5B EUR).</w:t>
-        <w:br/>
-        <w:t>• Q4: Phân tích độ tuổi vàng (Peak Age): Giai đoạn 25 - 28 tuổi đạt đỉnh giá trị trung bình 4.85M EUR/cầu thủ.</w:t>
+        <w:t>Top 15 cầu thủ giá trị cao nhất thế giới (Erling Haaland, Vinicius, Bellingham, Mbappe: 180M - 200M EUR).</w:t>
+      </w:r>
+    </w:p>
+    <w:p>
+      <w:pPr>
+        <w:spacing w:before="20" w:after="40" w:line="276" w:lineRule="auto"/>
+        <w:ind w:left="283"/>
+        <w:jc w:val="both"/>
+      </w:pPr>
+      <w:r>
+        <w:rPr>
+          <w:rFonts w:ascii="Times New Roman" w:hAnsi="Times New Roman"/>
+          <w:b/>
+          <w:i w:val="0"/>
+          <w:color w:val="0D766E"/>
+          <w:sz w:val="22"/>
+          <w:rFonts w:ascii="Times New Roman" w:hAnsi="Times New Roman" w:eastAsia="Times New Roman" w:cs="Times New Roman"/>
+        </w:rPr>
+        <w:t xml:space="preserve">• </w:t>
+      </w:r>
+      <w:r>
+        <w:rPr>
+          <w:rFonts w:ascii="Times New Roman" w:hAnsi="Times New Roman"/>
+          <w:b/>
+          <w:i w:val="0"/>
+          <w:color w:val="1B365D"/>
+          <w:sz w:val="22"/>
+          <w:rFonts w:ascii="Times New Roman" w:hAnsi="Times New Roman" w:eastAsia="Times New Roman" w:cs="Times New Roman"/>
+        </w:rPr>
+        <w:t xml:space="preserve">Truy vấn 2 (Q2): </w:t>
+      </w:r>
+      <w:r>
+        <w:rPr>
+          <w:rFonts w:ascii="Times New Roman" w:hAnsi="Times New Roman"/>
+          <w:b w:val="0"/>
+          <w:i w:val="0"/>
+          <w:color w:val="222222"/>
+          <w:sz w:val="22"/>
+          <w:rFonts w:ascii="Times New Roman" w:hAnsi="Times New Roman" w:eastAsia="Times New Roman" w:cs="Times New Roman"/>
+        </w:rPr>
+        <w:t>Định giá trung bình theo 4 vị trí chiến thuật (Attack: 3.2M EUR, Midfield: 2.8M EUR, Defender: 2.1M EUR, Goalkeeper: 1.4M EUR).</w:t>
+      </w:r>
+    </w:p>
+    <w:p>
+      <w:pPr>
+        <w:spacing w:before="20" w:after="40" w:line="276" w:lineRule="auto"/>
+        <w:ind w:left="283"/>
+        <w:jc w:val="both"/>
+      </w:pPr>
+      <w:r>
+        <w:rPr>
+          <w:rFonts w:ascii="Times New Roman" w:hAnsi="Times New Roman"/>
+          <w:b/>
+          <w:i w:val="0"/>
+          <w:color w:val="0D766E"/>
+          <w:sz w:val="22"/>
+          <w:rFonts w:ascii="Times New Roman" w:hAnsi="Times New Roman" w:eastAsia="Times New Roman" w:cs="Times New Roman"/>
+        </w:rPr>
+        <w:t xml:space="preserve">• </w:t>
+      </w:r>
+      <w:r>
+        <w:rPr>
+          <w:rFonts w:ascii="Times New Roman" w:hAnsi="Times New Roman"/>
+          <w:b/>
+          <w:i w:val="0"/>
+          <w:color w:val="1B365D"/>
+          <w:sz w:val="22"/>
+          <w:rFonts w:ascii="Times New Roman" w:hAnsi="Times New Roman" w:eastAsia="Times New Roman" w:cs="Times New Roman"/>
+        </w:rPr>
+        <w:t xml:space="preserve">Truy vấn 3 (Q3): </w:t>
+      </w:r>
+      <w:r>
+        <w:rPr>
+          <w:rFonts w:ascii="Times New Roman" w:hAnsi="Times New Roman"/>
+          <w:b w:val="0"/>
+          <w:i w:val="0"/>
+          <w:color w:val="222222"/>
+          <w:sz w:val="22"/>
+          <w:rFonts w:ascii="Times New Roman" w:hAnsi="Times New Roman" w:eastAsia="Times New Roman" w:cs="Times New Roman"/>
+        </w:rPr>
+        <w:t>Top 10 quốc gia sở hữu tổng giá trị cầu thủ lớn nhất thế giới (Anh: 4.8B EUR, Pháp: 4.2B EUR, TBN: 3.9B EUR, Brazil: 3.5B EUR).</w:t>
+      </w:r>
+    </w:p>
+    <w:p>
+      <w:pPr>
+        <w:spacing w:before="20" w:after="40" w:line="276" w:lineRule="auto"/>
+        <w:ind w:left="283"/>
+        <w:jc w:val="both"/>
+      </w:pPr>
+      <w:r>
+        <w:rPr>
+          <w:rFonts w:ascii="Times New Roman" w:hAnsi="Times New Roman"/>
+          <w:b/>
+          <w:i w:val="0"/>
+          <w:color w:val="0D766E"/>
+          <w:sz w:val="22"/>
+          <w:rFonts w:ascii="Times New Roman" w:hAnsi="Times New Roman" w:eastAsia="Times New Roman" w:cs="Times New Roman"/>
+        </w:rPr>
+        <w:t xml:space="preserve">• </w:t>
+      </w:r>
+      <w:r>
+        <w:rPr>
+          <w:rFonts w:ascii="Times New Roman" w:hAnsi="Times New Roman"/>
+          <w:b/>
+          <w:i w:val="0"/>
+          <w:color w:val="1B365D"/>
+          <w:sz w:val="22"/>
+          <w:rFonts w:ascii="Times New Roman" w:hAnsi="Times New Roman" w:eastAsia="Times New Roman" w:cs="Times New Roman"/>
+        </w:rPr>
+        <w:t xml:space="preserve">Truy vấn 4 (Q4): </w:t>
+      </w:r>
+      <w:r>
+        <w:rPr>
+          <w:rFonts w:ascii="Times New Roman" w:hAnsi="Times New Roman"/>
+          <w:b w:val="0"/>
+          <w:i w:val="0"/>
+          <w:color w:val="222222"/>
+          <w:sz w:val="22"/>
+          <w:rFonts w:ascii="Times New Roman" w:hAnsi="Times New Roman" w:eastAsia="Times New Roman" w:cs="Times New Roman"/>
+        </w:rPr>
+        <w:t>Phân tích độ tuổi vàng (Peak Age): Giai đoạn 25 - 28 tuổi đạt đỉnh giá trị trung bình 4.85M EUR/cầu thủ.</w:t>
       </w:r>
     </w:p>
     <w:p>
@@ -5003,6 +5426,7 @@
     </w:p>
     <w:p>
       <w:pPr>
+        <w:keepNext/>
         <w:spacing w:before="240" w:after="60" w:line="276" w:lineRule="auto"/>
         <w:jc w:val="left"/>
       </w:pPr>
@@ -5020,6 +5444,7 @@
     </w:p>
     <w:p>
       <w:pPr>
+        <w:keepNext/>
         <w:spacing w:before="160" w:after="40" w:line="276" w:lineRule="auto"/>
         <w:jc w:val="left"/>
       </w:pPr>
@@ -5877,6 +6302,7 @@
     </w:p>
     <w:p>
       <w:pPr>
+        <w:keepNext/>
         <w:spacing w:before="160" w:after="40" w:line="276" w:lineRule="auto"/>
         <w:jc w:val="left"/>
       </w:pPr>
@@ -6741,6 +7167,7 @@
     </w:p>
     <w:p>
       <w:pPr>
+        <w:keepNext/>
         <w:spacing w:before="240" w:after="60" w:line="276" w:lineRule="auto"/>
         <w:jc w:val="left"/>
       </w:pPr>
@@ -6758,6 +7185,7 @@
     </w:p>
     <w:p>
       <w:pPr>
+        <w:keepNext/>
         <w:spacing w:before="160" w:after="40" w:line="276" w:lineRule="auto"/>
         <w:jc w:val="left"/>
       </w:pPr>
@@ -6908,6 +7336,7 @@
     </w:p>
     <w:p>
       <w:pPr>
+        <w:keepNext/>
         <w:spacing w:before="160" w:after="40" w:line="276" w:lineRule="auto"/>
         <w:jc w:val="left"/>
       </w:pPr>
@@ -8378,6 +8807,7 @@
     </w:p>
     <w:p>
       <w:pPr>
+        <w:keepNext/>
         <w:spacing w:before="240" w:after="60" w:line="276" w:lineRule="auto"/>
         <w:jc w:val="left"/>
       </w:pPr>
@@ -8395,6 +8825,7 @@
     </w:p>
     <w:p>
       <w:pPr>
+        <w:keepNext/>
         <w:spacing w:before="160" w:after="40" w:line="276" w:lineRule="auto"/>
         <w:jc w:val="left"/>
       </w:pPr>
@@ -10407,6 +10838,7 @@
     </w:p>
     <w:p>
       <w:pPr>
+        <w:keepNext/>
         <w:spacing w:before="160" w:after="40" w:line="276" w:lineRule="auto"/>
         <w:jc w:val="left"/>
       </w:pPr>
@@ -10543,6 +10975,7 @@
     </w:p>
     <w:p>
       <w:pPr>
+        <w:keepNext/>
         <w:spacing w:before="240" w:after="60" w:line="276" w:lineRule="auto"/>
         <w:jc w:val="left"/>
       </w:pPr>
@@ -10560,6 +10993,7 @@
     </w:p>
     <w:p>
       <w:pPr>
+        <w:keepNext/>
         <w:spacing w:before="160" w:after="40" w:line="276" w:lineRule="auto"/>
         <w:jc w:val="left"/>
       </w:pPr>
@@ -10713,6 +11147,7 @@
     </w:p>
     <w:p>
       <w:pPr>
+        <w:keepNext/>
         <w:spacing w:before="160" w:after="40" w:line="276" w:lineRule="auto"/>
         <w:jc w:val="left"/>
       </w:pPr>
@@ -11506,6 +11941,7 @@
     </w:p>
     <w:p>
       <w:pPr>
+        <w:keepNext/>
         <w:spacing w:before="160" w:after="40" w:line="276" w:lineRule="auto"/>
         <w:jc w:val="left"/>
       </w:pPr>
@@ -12176,6 +12612,7 @@
     </w:p>
     <w:p>
       <w:pPr>
+        <w:keepNext/>
         <w:spacing w:before="160" w:after="40" w:line="276" w:lineRule="auto"/>
         <w:jc w:val="left"/>
       </w:pPr>
@@ -12193,9 +12630,32 @@
     </w:p>
     <w:p>
       <w:pPr>
-        <w:spacing w:before="0" w:after="60" w:line="276" w:lineRule="auto"/>
+        <w:spacing w:before="20" w:after="40" w:line="276" w:lineRule="auto"/>
+        <w:ind w:left="283"/>
         <w:jc w:val="both"/>
       </w:pPr>
+      <w:r>
+        <w:rPr>
+          <w:rFonts w:ascii="Times New Roman" w:hAnsi="Times New Roman"/>
+          <w:b/>
+          <w:i w:val="0"/>
+          <w:color w:val="0D766E"/>
+          <w:sz w:val="22"/>
+          <w:rFonts w:ascii="Times New Roman" w:hAnsi="Times New Roman" w:eastAsia="Times New Roman" w:cs="Times New Roman"/>
+        </w:rPr>
+        <w:t xml:space="preserve">• </w:t>
+      </w:r>
+      <w:r>
+        <w:rPr>
+          <w:rFonts w:ascii="Times New Roman" w:hAnsi="Times New Roman"/>
+          <w:b/>
+          <w:i w:val="0"/>
+          <w:color w:val="1B365D"/>
+          <w:sz w:val="22"/>
+          <w:rFonts w:ascii="Times New Roman" w:hAnsi="Times New Roman" w:eastAsia="Times New Roman" w:cs="Times New Roman"/>
+        </w:rPr>
+        <w:t xml:space="preserve">Bước 1 (Cài đặt thư viện): </w:t>
+      </w:r>
       <w:r>
         <w:rPr>
           <w:rFonts w:ascii="Times New Roman" w:hAnsi="Times New Roman"/>
@@ -12205,17 +12665,132 @@
           <w:sz w:val="22"/>
           <w:rFonts w:ascii="Times New Roman" w:hAnsi="Times New Roman" w:eastAsia="Times New Roman" w:cs="Times New Roman"/>
         </w:rPr>
-        <w:t>• Bước 1: Cài đặt thư viện: pip install pyspark findspark kafka-python streamlit pandas pyarrow scikit-learn python-docx Pillow</w:t>
-        <w:br/>
-        <w:t>• Bước 2: Chạy toàn bộ chuỗi Pipeline: Nhấp đúp CHAY_PIPELINE.bat (hoặc gõ: python Source_Code/run_pipeline.py)</w:t>
-        <w:br/>
-        <w:t>• Bước 3: Khởi chạy Web Dashboard: Nhấp đúp CHAY_WEB.bat (hoặc gõ: streamlit run Source_Code/08_dashboard_streamlit.py)</w:t>
-        <w:br/>
-        <w:t>• Bước 4: Khởi động Airflow: cd airflow &amp;&amp; docker compose up -d (truy cập http://localhost:8080)</w:t>
+        <w:t>pip install pyspark findspark kafka-python streamlit pandas pyarrow scikit-learn python-docx Pillow</w:t>
       </w:r>
     </w:p>
     <w:p>
       <w:pPr>
+        <w:spacing w:before="20" w:after="40" w:line="276" w:lineRule="auto"/>
+        <w:ind w:left="283"/>
+        <w:jc w:val="both"/>
+      </w:pPr>
+      <w:r>
+        <w:rPr>
+          <w:rFonts w:ascii="Times New Roman" w:hAnsi="Times New Roman"/>
+          <w:b/>
+          <w:i w:val="0"/>
+          <w:color w:val="0D766E"/>
+          <w:sz w:val="22"/>
+          <w:rFonts w:ascii="Times New Roman" w:hAnsi="Times New Roman" w:eastAsia="Times New Roman" w:cs="Times New Roman"/>
+        </w:rPr>
+        <w:t xml:space="preserve">• </w:t>
+      </w:r>
+      <w:r>
+        <w:rPr>
+          <w:rFonts w:ascii="Times New Roman" w:hAnsi="Times New Roman"/>
+          <w:b/>
+          <w:i w:val="0"/>
+          <w:color w:val="1B365D"/>
+          <w:sz w:val="22"/>
+          <w:rFonts w:ascii="Times New Roman" w:hAnsi="Times New Roman" w:eastAsia="Times New Roman" w:cs="Times New Roman"/>
+        </w:rPr>
+        <w:t xml:space="preserve">Bước 2 (Chạy chuỗi Pipeline): </w:t>
+      </w:r>
+      <w:r>
+        <w:rPr>
+          <w:rFonts w:ascii="Times New Roman" w:hAnsi="Times New Roman"/>
+          <w:b w:val="0"/>
+          <w:i w:val="0"/>
+          <w:color w:val="222222"/>
+          <w:sz w:val="22"/>
+          <w:rFonts w:ascii="Times New Roman" w:hAnsi="Times New Roman" w:eastAsia="Times New Roman" w:cs="Times New Roman"/>
+        </w:rPr>
+        <w:t>Nhấp đúp CHAY_PIPELINE.bat (hoặc gõ: python Source_Code/run_pipeline.py)</w:t>
+      </w:r>
+    </w:p>
+    <w:p>
+      <w:pPr>
+        <w:spacing w:before="20" w:after="40" w:line="276" w:lineRule="auto"/>
+        <w:ind w:left="283"/>
+        <w:jc w:val="both"/>
+      </w:pPr>
+      <w:r>
+        <w:rPr>
+          <w:rFonts w:ascii="Times New Roman" w:hAnsi="Times New Roman"/>
+          <w:b/>
+          <w:i w:val="0"/>
+          <w:color w:val="0D766E"/>
+          <w:sz w:val="22"/>
+          <w:rFonts w:ascii="Times New Roman" w:hAnsi="Times New Roman" w:eastAsia="Times New Roman" w:cs="Times New Roman"/>
+        </w:rPr>
+        <w:t xml:space="preserve">• </w:t>
+      </w:r>
+      <w:r>
+        <w:rPr>
+          <w:rFonts w:ascii="Times New Roman" w:hAnsi="Times New Roman"/>
+          <w:b/>
+          <w:i w:val="0"/>
+          <w:color w:val="1B365D"/>
+          <w:sz w:val="22"/>
+          <w:rFonts w:ascii="Times New Roman" w:hAnsi="Times New Roman" w:eastAsia="Times New Roman" w:cs="Times New Roman"/>
+        </w:rPr>
+        <w:t xml:space="preserve">Bước 3 (Khởi chạy Web Dashboard): </w:t>
+      </w:r>
+      <w:r>
+        <w:rPr>
+          <w:rFonts w:ascii="Times New Roman" w:hAnsi="Times New Roman"/>
+          <w:b w:val="0"/>
+          <w:i w:val="0"/>
+          <w:color w:val="222222"/>
+          <w:sz w:val="22"/>
+          <w:rFonts w:ascii="Times New Roman" w:hAnsi="Times New Roman" w:eastAsia="Times New Roman" w:cs="Times New Roman"/>
+        </w:rPr>
+        <w:t>Nhấp đúp CHAY_WEB.bat (hoặc gõ: streamlit run Source_Code/08_dashboard_streamlit.py)</w:t>
+      </w:r>
+    </w:p>
+    <w:p>
+      <w:pPr>
+        <w:spacing w:before="20" w:after="40" w:line="276" w:lineRule="auto"/>
+        <w:ind w:left="283"/>
+        <w:jc w:val="both"/>
+      </w:pPr>
+      <w:r>
+        <w:rPr>
+          <w:rFonts w:ascii="Times New Roman" w:hAnsi="Times New Roman"/>
+          <w:b/>
+          <w:i w:val="0"/>
+          <w:color w:val="0D766E"/>
+          <w:sz w:val="22"/>
+          <w:rFonts w:ascii="Times New Roman" w:hAnsi="Times New Roman" w:eastAsia="Times New Roman" w:cs="Times New Roman"/>
+        </w:rPr>
+        <w:t xml:space="preserve">• </w:t>
+      </w:r>
+      <w:r>
+        <w:rPr>
+          <w:rFonts w:ascii="Times New Roman" w:hAnsi="Times New Roman"/>
+          <w:b/>
+          <w:i w:val="0"/>
+          <w:color w:val="1B365D"/>
+          <w:sz w:val="22"/>
+          <w:rFonts w:ascii="Times New Roman" w:hAnsi="Times New Roman" w:eastAsia="Times New Roman" w:cs="Times New Roman"/>
+        </w:rPr>
+        <w:t xml:space="preserve">Bước 4 (Khởi động cụm Airflow): </w:t>
+      </w:r>
+      <w:r>
+        <w:rPr>
+          <w:rFonts w:ascii="Times New Roman" w:hAnsi="Times New Roman"/>
+          <w:b w:val="0"/>
+          <w:i w:val="0"/>
+          <w:color w:val="222222"/>
+          <w:sz w:val="22"/>
+          <w:rFonts w:ascii="Times New Roman" w:hAnsi="Times New Roman" w:eastAsia="Times New Roman" w:cs="Times New Roman"/>
+        </w:rPr>
+        <w:t>cd airflow &amp;&amp; docker compose up -d (truy cập http://localhost:8080)</w:t>
+      </w:r>
+    </w:p>
+    <w:p>
+      <w:pPr>
+        <w:keepNext/>
         <w:spacing w:before="160" w:after="40" w:line="276" w:lineRule="auto"/>
         <w:jc w:val="left"/>
       </w:pPr>

</xml_diff>